<commit_message>
Resubmission Fix: Updated report.docx
</commit_message>
<xml_diff>
--- a/report.docx
+++ b/report.docx
@@ -208,33 +208,33 @@
         <w:rPr>
           <w:rFonts w:hint="default" w:ascii="Times New Roman" w:hAnsi="Times New Roman" w:cs="Times New Roman"/>
         </w:rPr>
-        <w:t>The project was developed using Test-Driven Development (TDD) principles. Each feature and validation rule was guided by test cases following the Red-Green-Refactor cycle. The complete test suite contains 10 automated unit and integration tests implemented using Python’s built-in unittest framework.</w:t>
-      </w:r>
-    </w:p>
-    <w:p>
-      <w:pPr>
-        <w:rPr>
-          <w:rFonts w:hint="default" w:ascii="Times New Roman" w:hAnsi="Times New Roman" w:cs="Times New Roman"/>
-        </w:rPr>
-      </w:pPr>
-      <w:r>
-        <w:rPr>
-          <w:rFonts w:hint="default" w:ascii="Times New Roman" w:hAnsi="Times New Roman" w:cs="Times New Roman"/>
-        </w:rPr>
-        <w:t>The tests cover standard operations, empty inputs, single-value inputs, invalid data types, invalid numerical elements, and end-to-end pipeline execution. The implementation also verifies proper error propagation when invalid input is supplied to the pipeline.</w:t>
-      </w:r>
-    </w:p>
-    <w:p>
-      <w:pPr>
-        <w:rPr>
-          <w:rFonts w:hint="default" w:ascii="Times New Roman" w:hAnsi="Times New Roman" w:cs="Times New Roman"/>
-        </w:rPr>
-      </w:pPr>
-      <w:r>
-        <w:rPr>
-          <w:rFonts w:hint="default" w:ascii="Times New Roman" w:hAnsi="Times New Roman" w:cs="Times New Roman"/>
-        </w:rPr>
-        <w:t>All functionality was developed without external third-party dependencies. The final test execution completed successfully, with all 10 tests passing. This confirms that the implemented preprocessing components and their integration behave according to the defined requirements.</w:t>
+        <w:t>The project was developed using Test-Driven Development (TDD) principles. Each feature and validation rule was guided by test cases following the Red-Green-Refactor cycle. The complete suite contains 11 discovered unit and integration tests implemented using Python's built-in unittest framework.</w:t>
+      </w:r>
+    </w:p>
+    <w:p>
+      <w:pPr>
+        <w:rPr>
+          <w:rFonts w:hint="default" w:ascii="Times New Roman" w:hAnsi="Times New Roman" w:cs="Times New Roman"/>
+        </w:rPr>
+      </w:pPr>
+      <w:r>
+        <w:rPr>
+          <w:rFonts w:hint="default" w:ascii="Times New Roman" w:hAnsi="Times New Roman" w:cs="Times New Roman"/>
+        </w:rPr>
+        <w:t>The tests cover standard operations, empty inputs, constant numerical series, invalid data types, invalid numerical elements, mismatched pipeline input lengths, and successful end-to-end processing. The pipeline also validates that text and number lists have equal lengths before processing.</w:t>
+      </w:r>
+    </w:p>
+    <w:p>
+      <w:pPr>
+        <w:rPr>
+          <w:rFonts w:hint="default" w:ascii="Times New Roman" w:hAnsi="Times New Roman" w:cs="Times New Roman"/>
+        </w:rPr>
+      </w:pPr>
+      <w:r>
+        <w:rPr>
+          <w:rFonts w:hint="default" w:ascii="Times New Roman" w:hAnsi="Times New Roman" w:cs="Times New Roman"/>
+        </w:rPr>
+        <w:t>All functionality was developed without external third-party dependencies. The latest test execution completed successfully with all 11 tests passing. This confirms that the preprocessing components and their integration behave according to the defined requirements.</w:t>
       </w:r>
     </w:p>
     <w:p>
@@ -1011,7 +1011,7 @@
         <w:rPr>
           <w:rFonts w:hint="default" w:ascii="Times New Roman" w:hAnsi="Times New Roman" w:cs="Times New Roman"/>
         </w:rPr>
-        <w:t>The DataPipeline class integrates numerical and textual preprocessing operations. It ensures that individual components work together correctly and that errors from invalid input are propagated properly.</w:t>
+        <w:t>The DataPipeline class integrates numerical and textual preprocessing operations. It validates list types and matching lengths, then delegates text and numeric validation to the component classes.</w:t>
       </w:r>
     </w:p>
     <w:p>
@@ -1107,7 +1107,7 @@
         <w:rPr>
           <w:rFonts w:hint="default" w:ascii="Times New Roman" w:hAnsi="Times New Roman" w:cs="Times New Roman"/>
         </w:rPr>
-        <w:t>The project includes 10 automated tests divided into unit tests and integration tests.</w:t>
+        <w:t>The project currently discovers 11 automated tests divided into unit tests and integration tests. The latest run completed with 11 passes and no failures or errors.</w:t>
       </w:r>
     </w:p>
     <w:tbl>
@@ -1392,7 +1392,7 @@
                 <w:rFonts w:hint="default" w:ascii="Times New Roman" w:hAnsi="Times New Roman" w:cs="Times New Roman"/>
                 <w:b w:val="0"/>
               </w:rPr>
-              <w:t>2</w:t>
+              <w:t>3</w:t>
             </w:r>
           </w:p>
         </w:tc>
@@ -1457,7 +1457,7 @@
                 <w:rFonts w:hint="default" w:ascii="Times New Roman" w:hAnsi="Times New Roman" w:cs="Times New Roman"/>
                 <w:b w:val="0"/>
               </w:rPr>
-              <w:t>10</w:t>
+              <w:t>11</w:t>
             </w:r>
           </w:p>
         </w:tc>
@@ -1621,7 +1621,7 @@
         <w:rPr>
           <w:rFonts w:hint="default" w:ascii="Times New Roman" w:hAnsi="Times New Roman" w:cs="Times New Roman"/>
         </w:rPr>
-        <w:t>Invalid input propagation through the pipeline</w:t>
+        <w:t>Pipeline input validation and error handling</w:t>
       </w:r>
     </w:p>
     <w:p>
@@ -1691,7 +1691,20 @@
           <w:rFonts w:hint="default" w:ascii="Times New Roman" w:hAnsi="Times New Roman" w:cs="Times New Roman"/>
           <w:sz w:val="18"/>
         </w:rPr>
-        <w:t>test_min_max_scale_empty_list (test_core.TestDataScaler.test_min_max_scale_empty_list) ... ok</w:t>
+        <w:t>test_min_max_scale_empty_list (test_core.TestDataScaler.test_min_max_scale_empty_list) ... ok
+test_min_max_scale_invalid_elements (test_core.TestDataScaler.test_min_max_scale_invalid_elements) ... ok
+test_min_max_scale_invalid_type (test_core.TestDataScaler.test_min_max_scale_invalid_type) ... ok
+test_min_max_scale_normal (test_core.TestDataScaler.test_min_max_scale_normal) ... ok
+test_min_max_scale_single_value (test_core.TestDataScaler.test_min_max_scale_single_value) ... ok
+test_clean_text_empty (test_core.TestTextCleaner.test_clean_text_empty) ... ok
+test_clean_text_non_string_input (test_core.TestTextCleaner.test_clean_text_non_string_input) ... ok
+test_clean_text_normal (test_core.TestTextCleaner.test_clean_text_normal) ... ok
+test_pipeline_end_to_end_success (test_integration.TestDataPipelineIntegration.test_pipeline_end_to_end_success) ... ok
+test_pipeline_invalid_input_propagation (test_integration.TestDataPipelineIntegration.test_pipeline_invalid_input_propagation) ... ok
+test_pipeline_mismatched_lengths (test_integration.TestDataPipelineIntegration.test_pipeline_mismatched_lengths) ... ok
+----------------------------------------------------------------------
+Ran 11 tests in 0.012s
+OK</w:t>
       </w:r>
       <w:r>
         <w:rPr>
@@ -1705,7 +1718,6 @@
           <w:rFonts w:hint="default" w:ascii="Times New Roman" w:hAnsi="Times New Roman" w:cs="Times New Roman"/>
           <w:sz w:val="18"/>
         </w:rPr>
-        <w:t>test_min_max_scale_invalid_elements (test_core.TestDataScaler.test_min_max_scale_invalid_elements) ... ok</w:t>
       </w:r>
       <w:r>
         <w:rPr>
@@ -1719,7 +1731,6 @@
           <w:rFonts w:hint="default" w:ascii="Times New Roman" w:hAnsi="Times New Roman" w:cs="Times New Roman"/>
           <w:sz w:val="18"/>
         </w:rPr>
-        <w:t>test_min_max_scale_invalid_type (test_core.TestDataScaler.test_min_max_scale_invalid_type) ... ok</w:t>
       </w:r>
       <w:r>
         <w:rPr>
@@ -1733,7 +1744,6 @@
           <w:rFonts w:hint="default" w:ascii="Times New Roman" w:hAnsi="Times New Roman" w:cs="Times New Roman"/>
           <w:sz w:val="18"/>
         </w:rPr>
-        <w:t>test_min_max_scale_normal (test_core.TestDataScaler.test_min_max_scale_normal) ... ok</w:t>
       </w:r>
       <w:r>
         <w:rPr>
@@ -1747,7 +1757,6 @@
           <w:rFonts w:hint="default" w:ascii="Times New Roman" w:hAnsi="Times New Roman" w:cs="Times New Roman"/>
           <w:sz w:val="18"/>
         </w:rPr>
-        <w:t>test_min_max_scale_single_value (test_core.TestDataScaler.test_min_max_scale_single_value) ... ok</w:t>
       </w:r>
       <w:r>
         <w:rPr>
@@ -1761,7 +1770,6 @@
           <w:rFonts w:hint="default" w:ascii="Times New Roman" w:hAnsi="Times New Roman" w:cs="Times New Roman"/>
           <w:sz w:val="18"/>
         </w:rPr>
-        <w:t>test_clean_text_empty (test_core.TestTextCleaner.test_clean_text_empty) ... ok</w:t>
       </w:r>
       <w:r>
         <w:rPr>
@@ -1775,7 +1783,6 @@
           <w:rFonts w:hint="default" w:ascii="Times New Roman" w:hAnsi="Times New Roman" w:cs="Times New Roman"/>
           <w:sz w:val="18"/>
         </w:rPr>
-        <w:t>test_clean_text_non_string_input (test_core.TestTextCleaner.test_clean_text_non_string_input) ... ok</w:t>
       </w:r>
       <w:r>
         <w:rPr>
@@ -1789,7 +1796,6 @@
           <w:rFonts w:hint="default" w:ascii="Times New Roman" w:hAnsi="Times New Roman" w:cs="Times New Roman"/>
           <w:sz w:val="18"/>
         </w:rPr>
-        <w:t>test_clean_text_normal (test_core.TestTextCleaner.test_clean_text_normal) ... ok</w:t>
       </w:r>
       <w:r>
         <w:rPr>
@@ -1803,7 +1809,6 @@
           <w:rFonts w:hint="default" w:ascii="Times New Roman" w:hAnsi="Times New Roman" w:cs="Times New Roman"/>
           <w:sz w:val="18"/>
         </w:rPr>
-        <w:t>test_pipeline_end_to_end_success (test_integration.TestDataPipelineIntegration.test_pipeline_end_to_end_success) ... ok</w:t>
       </w:r>
       <w:r>
         <w:rPr>
@@ -1817,7 +1822,6 @@
           <w:rFonts w:hint="default" w:ascii="Times New Roman" w:hAnsi="Times New Roman" w:cs="Times New Roman"/>
           <w:sz w:val="18"/>
         </w:rPr>
-        <w:t>test_pipeline_invalid_input_propagation (test_integration.TestDataPipelineIntegration.test_pipeline_invalid_input_propagation) ... ok</w:t>
       </w:r>
       <w:r>
         <w:rPr>
@@ -1838,7 +1842,6 @@
           <w:rFonts w:hint="default" w:ascii="Times New Roman" w:hAnsi="Times New Roman" w:cs="Times New Roman"/>
           <w:sz w:val="18"/>
         </w:rPr>
-        <w:t>----------------------------------------------------------------------</w:t>
       </w:r>
       <w:r>
         <w:rPr>
@@ -1852,7 +1855,6 @@
           <w:rFonts w:hint="default" w:ascii="Times New Roman" w:hAnsi="Times New Roman" w:cs="Times New Roman"/>
           <w:sz w:val="18"/>
         </w:rPr>
-        <w:t>Ran 10 tests in 0.014s</w:t>
       </w:r>
       <w:r>
         <w:rPr>
@@ -1873,7 +1875,6 @@
           <w:rFonts w:hint="default" w:ascii="Times New Roman" w:hAnsi="Times New Roman" w:cs="Times New Roman"/>
           <w:sz w:val="18"/>
         </w:rPr>
-        <w:t>OK</w:t>
       </w:r>
       <w:r>
         <w:rPr>
@@ -1881,7 +1882,6 @@
           <w:sz w:val="18"/>
           <w:lang w:val="en-US"/>
         </w:rPr>
-        <w:t>.</w:t>
       </w:r>
     </w:p>
     <w:tbl>
@@ -2036,7 +2036,7 @@
                 <w:rFonts w:hint="default" w:ascii="Times New Roman" w:hAnsi="Times New Roman" w:cs="Times New Roman"/>
                 <w:b w:val="0"/>
               </w:rPr>
-              <w:t>10</w:t>
+              <w:t>11</w:t>
             </w:r>
           </w:p>
         </w:tc>
@@ -2101,7 +2101,7 @@
                 <w:rFonts w:hint="default" w:ascii="Times New Roman" w:hAnsi="Times New Roman" w:cs="Times New Roman"/>
                 <w:b w:val="0"/>
               </w:rPr>
-              <w:t>10</w:t>
+              <w:t>11</w:t>
             </w:r>
           </w:p>
         </w:tc>
@@ -2296,7 +2296,7 @@
                 <w:rFonts w:hint="default" w:ascii="Times New Roman" w:hAnsi="Times New Roman" w:cs="Times New Roman"/>
                 <w:b w:val="0"/>
               </w:rPr>
-              <w:t>0.014s</w:t>
+              <w:t>0.012s</w:t>
             </w:r>
           </w:p>
         </w:tc>
@@ -3638,7 +3638,7 @@
         <w:rPr>
           <w:rFonts w:hint="default" w:ascii="Times New Roman" w:hAnsi="Times New Roman" w:cs="Times New Roman"/>
         </w:rPr>
-        <w:t>The final test execution produced 10 passing tests with 0 failures, providing concrete evidence of robust software development practices.</w:t>
+        <w:t>The latest test execution produced 11 passing tests with 0 failures and 0 errors, providing concrete evidence of reliable software development practices and complete coverage of the current requirements.</w:t>
       </w:r>
     </w:p>
     <w:p/>

</xml_diff>

<commit_message>
report extension error cleared
</commit_message>
<xml_diff>
--- a/report.docx
+++ b/report.docx
@@ -451,6 +451,12 @@
             <w:insideH w:val="single" w:color="auto" w:sz="4" w:space="0"/>
             <w:insideV w:val="single" w:color="auto" w:sz="4" w:space="0"/>
           </w:tblBorders>
+          <w:tblCellMar>
+            <w:top w:w="0" w:type="dxa"/>
+            <w:left w:w="108" w:type="dxa"/>
+            <w:bottom w:w="0" w:type="dxa"/>
+            <w:right w:w="108" w:type="dxa"/>
+          </w:tblCellMar>
         </w:tblPrEx>
         <w:trPr>
           <w:jc w:val="center"/>
@@ -1718,6 +1724,7 @@
           <w:rFonts w:hint="default" w:ascii="Times New Roman" w:hAnsi="Times New Roman" w:cs="Times New Roman"/>
           <w:sz w:val="18"/>
         </w:rPr>
+        <w:br w:type="textWrapping"/>
       </w:r>
       <w:r>
         <w:rPr>
@@ -1731,6 +1738,7 @@
           <w:rFonts w:hint="default" w:ascii="Times New Roman" w:hAnsi="Times New Roman" w:cs="Times New Roman"/>
           <w:sz w:val="18"/>
         </w:rPr>
+        <w:br w:type="textWrapping"/>
       </w:r>
       <w:r>
         <w:rPr>
@@ -1744,6 +1752,7 @@
           <w:rFonts w:hint="default" w:ascii="Times New Roman" w:hAnsi="Times New Roman" w:cs="Times New Roman"/>
           <w:sz w:val="18"/>
         </w:rPr>
+        <w:br w:type="textWrapping"/>
       </w:r>
       <w:r>
         <w:rPr>
@@ -1757,6 +1766,7 @@
           <w:rFonts w:hint="default" w:ascii="Times New Roman" w:hAnsi="Times New Roman" w:cs="Times New Roman"/>
           <w:sz w:val="18"/>
         </w:rPr>
+        <w:br w:type="textWrapping"/>
       </w:r>
       <w:r>
         <w:rPr>
@@ -1770,6 +1780,7 @@
           <w:rFonts w:hint="default" w:ascii="Times New Roman" w:hAnsi="Times New Roman" w:cs="Times New Roman"/>
           <w:sz w:val="18"/>
         </w:rPr>
+        <w:br w:type="textWrapping"/>
       </w:r>
       <w:r>
         <w:rPr>
@@ -1783,6 +1794,7 @@
           <w:rFonts w:hint="default" w:ascii="Times New Roman" w:hAnsi="Times New Roman" w:cs="Times New Roman"/>
           <w:sz w:val="18"/>
         </w:rPr>
+        <w:br w:type="textWrapping"/>
       </w:r>
       <w:r>
         <w:rPr>
@@ -1796,92 +1808,7 @@
           <w:rFonts w:hint="default" w:ascii="Times New Roman" w:hAnsi="Times New Roman" w:cs="Times New Roman"/>
           <w:sz w:val="18"/>
         </w:rPr>
-      </w:r>
-      <w:r>
-        <w:rPr>
-          <w:rFonts w:hint="default" w:ascii="Times New Roman" w:hAnsi="Times New Roman" w:cs="Times New Roman"/>
-          <w:sz w:val="18"/>
-        </w:rPr>
         <w:br w:type="textWrapping"/>
-      </w:r>
-      <w:r>
-        <w:rPr>
-          <w:rFonts w:hint="default" w:ascii="Times New Roman" w:hAnsi="Times New Roman" w:cs="Times New Roman"/>
-          <w:sz w:val="18"/>
-        </w:rPr>
-      </w:r>
-      <w:r>
-        <w:rPr>
-          <w:rFonts w:hint="default" w:ascii="Times New Roman" w:hAnsi="Times New Roman" w:cs="Times New Roman"/>
-          <w:sz w:val="18"/>
-        </w:rPr>
-        <w:br w:type="textWrapping"/>
-      </w:r>
-      <w:r>
-        <w:rPr>
-          <w:rFonts w:hint="default" w:ascii="Times New Roman" w:hAnsi="Times New Roman" w:cs="Times New Roman"/>
-          <w:sz w:val="18"/>
-        </w:rPr>
-      </w:r>
-      <w:r>
-        <w:rPr>
-          <w:rFonts w:hint="default" w:ascii="Times New Roman" w:hAnsi="Times New Roman" w:cs="Times New Roman"/>
-          <w:sz w:val="18"/>
-        </w:rPr>
-        <w:br w:type="textWrapping"/>
-      </w:r>
-      <w:r>
-        <w:rPr>
-          <w:rFonts w:hint="default" w:ascii="Times New Roman" w:hAnsi="Times New Roman" w:cs="Times New Roman"/>
-          <w:sz w:val="18"/>
-        </w:rPr>
-        <w:br w:type="textWrapping"/>
-      </w:r>
-      <w:r>
-        <w:rPr>
-          <w:rFonts w:hint="default" w:ascii="Times New Roman" w:hAnsi="Times New Roman" w:cs="Times New Roman"/>
-          <w:sz w:val="18"/>
-        </w:rPr>
-      </w:r>
-      <w:r>
-        <w:rPr>
-          <w:rFonts w:hint="default" w:ascii="Times New Roman" w:hAnsi="Times New Roman" w:cs="Times New Roman"/>
-          <w:sz w:val="18"/>
-        </w:rPr>
-        <w:br w:type="textWrapping"/>
-      </w:r>
-      <w:r>
-        <w:rPr>
-          <w:rFonts w:hint="default" w:ascii="Times New Roman" w:hAnsi="Times New Roman" w:cs="Times New Roman"/>
-          <w:sz w:val="18"/>
-        </w:rPr>
-      </w:r>
-      <w:r>
-        <w:rPr>
-          <w:rFonts w:hint="default" w:ascii="Times New Roman" w:hAnsi="Times New Roman" w:cs="Times New Roman"/>
-          <w:sz w:val="18"/>
-        </w:rPr>
-        <w:br w:type="textWrapping"/>
-      </w:r>
-      <w:r>
-        <w:rPr>
-          <w:rFonts w:hint="default" w:ascii="Times New Roman" w:hAnsi="Times New Roman" w:cs="Times New Roman"/>
-          <w:sz w:val="18"/>
-        </w:rPr>
-        <w:br w:type="textWrapping"/>
-      </w:r>
-      <w:r>
-        <w:rPr>
-          <w:rFonts w:hint="default" w:ascii="Times New Roman" w:hAnsi="Times New Roman" w:cs="Times New Roman"/>
-          <w:sz w:val="18"/>
-        </w:rPr>
-      </w:r>
-      <w:r>
-        <w:rPr>
-          <w:rFonts w:hint="default" w:ascii="Times New Roman" w:hAnsi="Times New Roman" w:cs="Times New Roman"/>
-          <w:sz w:val="18"/>
-          <w:lang w:val="en-US"/>
-        </w:rPr>
       </w:r>
     </w:p>
     <w:tbl>
@@ -3642,6 +3569,7 @@
       </w:r>
     </w:p>
     <w:p/>
+    <w:p/>
     <w:p>
       <w:bookmarkStart w:id="0" w:name="_GoBack"/>
       <w:bookmarkEnd w:id="0"/>
@@ -3727,9 +3655,30 @@
 <file path=word/numbering.xml><?xml version="1.0" encoding="utf-8"?>
 <w:numbering xmlns:wpc="http://schemas.microsoft.com/office/word/2010/wordprocessingCanvas" xmlns:mc="http://schemas.openxmlformats.org/markup-compatibility/2006" xmlns:o="urn:schemas-microsoft-com:office:office" xmlns:r="http://schemas.openxmlformats.org/officeDocument/2006/relationships" xmlns:m="http://schemas.openxmlformats.org/officeDocument/2006/math" xmlns:v="urn:schemas-microsoft-com:vml" xmlns:wp14="http://schemas.microsoft.com/office/word/2010/wordprocessingDrawing" xmlns:wp="http://schemas.openxmlformats.org/drawingml/2006/wordprocessingDrawing" xmlns:w10="urn:schemas-microsoft-com:office:word" xmlns:w="http://schemas.openxmlformats.org/wordprocessingml/2006/main" xmlns:w14="http://schemas.microsoft.com/office/word/2010/wordml" xmlns:wpg="http://schemas.microsoft.com/office/word/2010/wordprocessingGroup" xmlns:wpi="http://schemas.microsoft.com/office/word/2010/wordprocessingInk" xmlns:wne="http://schemas.microsoft.com/office/word/2006/wordml" xmlns:wps="http://schemas.microsoft.com/office/word/2010/wordprocessingShape" xmlns:wpsCustomData="http://www.wps.cn/officeDocument/2013/wpsCustomData" mc:Ignorable="w14 wp14">
   <w:abstractNum w:abstractNumId="0">
-    <w:nsid w:val="9EB4446E"/>
+    <w:nsid w:val="B5C0601B"/>
     <w:multiLevelType w:val="singleLevel"/>
-    <w:tmpl w:val="9EB4446E"/>
+    <w:tmpl w:val="B5C0601B"/>
+    <w:lvl w:ilvl="0" w:tentative="0">
+      <w:start w:val="1"/>
+      <w:numFmt w:val="bullet"/>
+      <w:pStyle w:val="7"/>
+      <w:lvlText w:val=""/>
+      <w:lvlJc w:val="left"/>
+      <w:pPr>
+        <w:tabs>
+          <w:tab w:val="left" w:pos="360"/>
+        </w:tabs>
+        <w:ind w:left="360" w:hanging="360" w:hangingChars="200"/>
+      </w:pPr>
+      <w:rPr>
+        <w:rFonts w:hint="default" w:ascii="Wingdings" w:hAnsi="Wingdings"/>
+      </w:rPr>
+    </w:lvl>
+  </w:abstractNum>
+  <w:abstractNum w:abstractNumId="1">
+    <w:nsid w:val="B8ADA5B0"/>
+    <w:multiLevelType w:val="singleLevel"/>
+    <w:tmpl w:val="B8ADA5B0"/>
     <w:lvl w:ilvl="0" w:tentative="0">
       <w:start w:val="1"/>
       <w:numFmt w:val="decimal"/>
@@ -3742,27 +3691,6 @@
         </w:tabs>
         <w:ind w:left="360" w:hanging="360" w:hangingChars="200"/>
       </w:pPr>
-    </w:lvl>
-  </w:abstractNum>
-  <w:abstractNum w:abstractNumId="1">
-    <w:nsid w:val="2249C58A"/>
-    <w:multiLevelType w:val="singleLevel"/>
-    <w:tmpl w:val="2249C58A"/>
-    <w:lvl w:ilvl="0" w:tentative="0">
-      <w:start w:val="1"/>
-      <w:numFmt w:val="bullet"/>
-      <w:pStyle w:val="7"/>
-      <w:lvlText w:val=""/>
-      <w:lvlJc w:val="left"/>
-      <w:pPr>
-        <w:tabs>
-          <w:tab w:val="left" w:pos="360"/>
-        </w:tabs>
-        <w:ind w:left="360" w:hanging="360" w:hangingChars="200"/>
-      </w:pPr>
-      <w:rPr>
-        <w:rFonts w:hint="default" w:ascii="Wingdings" w:hAnsi="Wingdings"/>
-      </w:rPr>
     </w:lvl>
   </w:abstractNum>
   <w:abstractNum w:abstractNumId="2">
@@ -3778,10 +3706,10 @@
     </w:lvl>
   </w:abstractNum>
   <w:num w:numId="1">
-    <w:abstractNumId w:val="1"/>
+    <w:abstractNumId w:val="0"/>
   </w:num>
   <w:num w:numId="2">
-    <w:abstractNumId w:val="0"/>
+    <w:abstractNumId w:val="1"/>
   </w:num>
   <w:num w:numId="3">
     <w:abstractNumId w:val="2"/>
@@ -3948,7 +3876,7 @@
     <w:lsdException w:unhideWhenUsed="0" w:uiPriority="0" w:semiHidden="0" w:name="Table Web 2"/>
     <w:lsdException w:unhideWhenUsed="0" w:uiPriority="0" w:semiHidden="0" w:name="Table Web 3"/>
     <w:lsdException w:unhideWhenUsed="0" w:uiPriority="0" w:semiHidden="0" w:name="Balloon Text"/>
-    <w:lsdException w:unhideWhenUsed="0" w:uiPriority="59" w:semiHidden="0" w:name="Table Grid"/>
+    <w:lsdException w:qFormat="1" w:unhideWhenUsed="0" w:uiPriority="59" w:semiHidden="0" w:name="Table Grid"/>
     <w:lsdException w:unhideWhenUsed="0" w:uiPriority="0" w:semiHidden="0" w:name="Table Theme"/>
     <w:lsdException w:unhideWhenUsed="0" w:uiPriority="60" w:semiHidden="0" w:name="Light Shading"/>
     <w:lsdException w:unhideWhenUsed="0" w:uiPriority="61" w:semiHidden="0" w:name="Light List"/>
@@ -4163,6 +4091,7 @@
   <w:style w:type="table" w:styleId="9">
     <w:name w:val="Table Grid"/>
     <w:basedOn w:val="5"/>
+    <w:qFormat/>
     <w:uiPriority w:val="59"/>
     <w:pPr>
       <w:spacing w:after="0" w:line="240" w:lineRule="auto"/>

</xml_diff>